<commit_message>
chore(materials): cap nhat bo cuc mau BBNT ky tay (chinh tay trong Word)
Co-Authored-By: Claude Fable 5 <noreply@anthropic.com>
</commit_message>
<xml_diff>
--- a/templates/bbnt-template.docx
+++ b/templates/bbnt-template.docx
@@ -17,12 +17,6 @@
         <w:gridCol w:w="5181"/>
       </w:tblGrid>
       <w:tr>
-        <w:tblPrEx>
-          <w:tblCellMar>
-            <w:top w:w="0" w:type="dxa"/>
-            <w:bottom w:w="0" w:type="dxa"/>
-          </w:tblCellMar>
-        </w:tblPrEx>
         <w:tc>
           <w:tcPr>
             <w:tcW w:w="4500" w:type="dxa"/>
@@ -149,12 +143,6 @@
         <w:gridCol w:w="5103"/>
       </w:tblGrid>
       <w:tr>
-        <w:tblPrEx>
-          <w:tblCellMar>
-            <w:top w:w="0" w:type="dxa"/>
-            <w:bottom w:w="0" w:type="dxa"/>
-          </w:tblCellMar>
-        </w:tblPrEx>
         <w:tc>
           <w:tcPr>
             <w:tcW w:w="4253" w:type="dxa"/>
@@ -181,7 +169,29 @@
                 <w:sz w:val="26"/>
                 <w:szCs w:val="26"/>
               </w:rPr>
-              <w:t>{{unit}}</w:t>
+              <w:t>{{unit}} -</w:t>
+            </w:r>
+            <w:r>
+              <w:rPr>
+                <w:rFonts w:ascii="Times New Roman" w:hAnsi="Times New Roman" w:cs="Times New Roman"/>
+              </w:rPr>
+              <w:t xml:space="preserve"> DH1</w:t>
+            </w:r>
+          </w:p>
+        </w:tc>
+        <w:tc>
+          <w:tcPr>
+            <w:tcW w:w="5103" w:type="dxa"/>
+          </w:tcPr>
+          <w:p>
+            <w:pPr>
+              <w:spacing w:after="60"/>
+            </w:pPr>
+            <w:r>
+              <w:rPr>
+                <w:rFonts w:ascii="Times New Roman" w:hAnsi="Times New Roman" w:cs="Times New Roman"/>
+              </w:rPr>
+              <w:t xml:space="preserve">PCT số: </w:t>
             </w:r>
             <w:r>
               <w:rPr>
@@ -189,36 +199,25 @@
                 <w:sz w:val="26"/>
                 <w:szCs w:val="26"/>
               </w:rPr>
-              <w:t xml:space="preserve"> -</w:t>
-            </w:r>
-            <w:r>
-              <w:rPr>
-                <w:rFonts w:ascii="Times New Roman" w:hAnsi="Times New Roman" w:cs="Times New Roman"/>
-              </w:rPr>
-              <w:t xml:space="preserve"> DH1</w:t>
-            </w:r>
-          </w:p>
-        </w:tc>
-        <w:tc>
-          <w:tcPr>
-            <w:tcW w:w="5103" w:type="dxa"/>
-          </w:tcPr>
-          <w:p>
-            <w:pPr>
-              <w:spacing w:after="60"/>
-            </w:pPr>
-            <w:r>
-              <w:rPr>
-                <w:rFonts w:ascii="Times New Roman" w:hAnsi="Times New Roman" w:cs="Times New Roman"/>
-              </w:rPr>
-              <w:t xml:space="preserve">PCT </w:t>
-            </w:r>
-            <w:proofErr w:type="gramStart"/>
-            <w:r>
-              <w:rPr>
-                <w:rFonts w:ascii="Times New Roman" w:hAnsi="Times New Roman" w:cs="Times New Roman"/>
-              </w:rPr>
-              <w:t xml:space="preserve">số: </w:t>
+              <w:t>{{pctNumber}}</w:t>
+            </w:r>
+          </w:p>
+        </w:tc>
+      </w:tr>
+      <w:tr>
+        <w:tc>
+          <w:tcPr>
+            <w:tcW w:w="4253" w:type="dxa"/>
+          </w:tcPr>
+          <w:p>
+            <w:pPr>
+              <w:spacing w:after="60"/>
+            </w:pPr>
+            <w:r>
+              <w:rPr>
+                <w:rFonts w:ascii="Times New Roman" w:hAnsi="Times New Roman" w:cs="Times New Roman"/>
+              </w:rPr>
+              <w:t xml:space="preserve">Tên thiết bị: </w:t>
             </w:r>
             <w:r>
               <w:rPr>
@@ -226,40 +225,163 @@
                 <w:sz w:val="26"/>
                 <w:szCs w:val="26"/>
               </w:rPr>
-              <w:t>{{</w:t>
-            </w:r>
-            <w:proofErr w:type="gramEnd"/>
+              <w:t>{{deviceNameManual}}</w:t>
+            </w:r>
+          </w:p>
+        </w:tc>
+        <w:tc>
+          <w:tcPr>
+            <w:tcW w:w="5103" w:type="dxa"/>
+          </w:tcPr>
+          <w:p>
+            <w:pPr>
+              <w:spacing w:after="60"/>
+            </w:pPr>
+            <w:r>
+              <w:rPr>
+                <w:rFonts w:ascii="Times New Roman" w:hAnsi="Times New Roman" w:cs="Times New Roman"/>
+              </w:rPr>
+              <w:t>Lý do:</w:t>
+            </w:r>
+            <w:r>
+              <w:rPr>
+                <w:rFonts w:ascii="Times New Roman" w:hAnsi="Times New Roman" w:cs="Times New Roman"/>
+              </w:rPr>
+              <w:t xml:space="preserve"> </w:t>
+            </w:r>
+            <w:r>
+              <w:rPr>
+                <w:rFonts w:ascii="Times New Roman" w:hAnsi="Times New Roman" w:cs="Times New Roman"/>
+              </w:rPr>
+              <w:t>{{soBBKT}}</w:t>
+            </w:r>
+          </w:p>
+        </w:tc>
+      </w:tr>
+      <w:tr>
+        <w:tc>
+          <w:tcPr>
+            <w:tcW w:w="4253" w:type="dxa"/>
+          </w:tcPr>
+          <w:p>
+            <w:pPr>
+              <w:spacing w:after="60"/>
+            </w:pPr>
+            <w:r>
+              <w:rPr>
+                <w:rFonts w:ascii="Times New Roman" w:hAnsi="Times New Roman" w:cs="Times New Roman"/>
+              </w:rPr>
+              <w:t>Mã KKS: {{maKKS}}</w:t>
+            </w:r>
+          </w:p>
+        </w:tc>
+        <w:tc>
+          <w:tcPr>
+            <w:tcW w:w="5103" w:type="dxa"/>
+          </w:tcPr>
+          <w:p>
+            <w:pPr>
+              <w:spacing w:after="60"/>
+            </w:pPr>
+            <w:r>
+              <w:rPr>
+                <w:rFonts w:ascii="Times New Roman" w:hAnsi="Times New Roman" w:cs="Times New Roman"/>
+              </w:rPr>
+              <w:t>Ngày bổ sung: {{ngayXuat}}</w:t>
+            </w:r>
+          </w:p>
+        </w:tc>
+      </w:tr>
+      <w:tr>
+        <w:tc>
+          <w:tcPr>
+            <w:tcW w:w="4253" w:type="dxa"/>
+            <w:vMerge w:val="restart"/>
+          </w:tcPr>
+          <w:p>
+            <w:pPr>
+              <w:spacing w:after="60"/>
+            </w:pPr>
+            <w:r>
+              <w:rPr>
+                <w:rFonts w:ascii="Times New Roman" w:hAnsi="Times New Roman" w:cs="Times New Roman"/>
+              </w:rPr>
+              <w:t>Thông số kỹ thuật: {{tenVatTu}}</w:t>
+            </w:r>
+          </w:p>
+        </w:tc>
+        <w:tc>
+          <w:tcPr>
+            <w:tcW w:w="5103" w:type="dxa"/>
+          </w:tcPr>
+          <w:p>
+            <w:pPr>
+              <w:spacing w:after="60"/>
+            </w:pPr>
+            <w:r>
+              <w:rPr>
+                <w:rFonts w:ascii="Times New Roman" w:hAnsi="Times New Roman" w:cs="Times New Roman"/>
+              </w:rPr>
+              <w:t>Thời tiết: Bình thường</w:t>
+            </w:r>
+          </w:p>
+        </w:tc>
+      </w:tr>
+      <w:tr>
+        <w:tc>
+          <w:tcPr>
+            <w:tcW w:w="4253" w:type="dxa"/>
+            <w:vMerge/>
+          </w:tcPr>
+          <w:p>
+            <w:pPr>
+              <w:spacing w:after="60"/>
+            </w:pPr>
+          </w:p>
+        </w:tc>
+        <w:tc>
+          <w:tcPr>
+            <w:tcW w:w="5103" w:type="dxa"/>
+          </w:tcPr>
+          <w:p>
+            <w:pPr>
+              <w:spacing w:after="0"/>
+            </w:pPr>
+            <w:r>
+              <w:rPr>
+                <w:rFonts w:ascii="Times New Roman" w:hAnsi="Times New Roman" w:cs="Times New Roman"/>
+              </w:rPr>
+              <w:t>Người kiểm tra:</w:t>
+            </w:r>
+          </w:p>
+          <w:p>
+            <w:pPr>
+              <w:spacing w:after="0"/>
+            </w:pPr>
+            <w:r>
+              <w:rPr>
+                <w:rFonts w:ascii="Times New Roman" w:hAnsi="Times New Roman" w:cs="Times New Roman"/>
+              </w:rPr>
+              <w:t>{{tenChiHuy}} - SCCN</w:t>
+            </w:r>
+          </w:p>
+          <w:p>
+            <w:pPr>
+              <w:spacing w:after="0"/>
+            </w:pPr>
             <w:r>
               <w:rPr>
                 <w:rFonts w:ascii="Times New Roman" w:hAnsi="Times New Roman" w:cs="Times New Roman"/>
                 <w:sz w:val="26"/>
                 <w:szCs w:val="26"/>
               </w:rPr>
-              <w:t>pctNumber}}</w:t>
-            </w:r>
-          </w:p>
-        </w:tc>
-      </w:tr>
-      <w:tr>
-        <w:tblPrEx>
-          <w:tblCellMar>
-            <w:top w:w="0" w:type="dxa"/>
-            <w:bottom w:w="0" w:type="dxa"/>
-          </w:tblCellMar>
-        </w:tblPrEx>
-        <w:tc>
-          <w:tcPr>
-            <w:tcW w:w="4253" w:type="dxa"/>
-          </w:tcPr>
-          <w:p>
-            <w:pPr>
-              <w:spacing w:after="60"/>
-            </w:pPr>
-            <w:r>
-              <w:rPr>
-                <w:rFonts w:ascii="Times New Roman" w:hAnsi="Times New Roman" w:cs="Times New Roman"/>
-              </w:rPr>
-              <w:t xml:space="preserve">Tên thiết bị: </w:t>
+              <w:t>{{usedByName}}</w:t>
+            </w:r>
+            <w:r>
+              <w:rPr>
+                <w:rFonts w:ascii="Times New Roman" w:hAnsi="Times New Roman" w:cs="Times New Roman"/>
+              </w:rPr>
+              <w:t xml:space="preserve">- </w:t>
             </w:r>
             <w:r>
               <w:rPr>
@@ -267,209 +389,7 @@
                 <w:sz w:val="26"/>
                 <w:szCs w:val="26"/>
               </w:rPr>
-              <w:t>{{deviceNameManual}}</w:t>
-            </w:r>
-          </w:p>
-        </w:tc>
-        <w:tc>
-          <w:tcPr>
-            <w:tcW w:w="5103" w:type="dxa"/>
-          </w:tcPr>
-          <w:p>
-            <w:pPr>
-              <w:spacing w:after="60"/>
-            </w:pPr>
-            <w:r>
-              <w:rPr>
-                <w:rFonts w:ascii="Times New Roman" w:hAnsi="Times New Roman" w:cs="Times New Roman"/>
-              </w:rPr>
-              <w:t xml:space="preserve">Lý </w:t>
-            </w:r>
-            <w:proofErr w:type="gramStart"/>
-            <w:r>
-              <w:rPr>
-                <w:rFonts w:ascii="Times New Roman" w:hAnsi="Times New Roman" w:cs="Times New Roman"/>
-              </w:rPr>
-              <w:t>do</w:t>
-            </w:r>
-            <w:proofErr w:type="gramEnd"/>
-            <w:r>
-              <w:rPr>
-                <w:rFonts w:ascii="Times New Roman" w:hAnsi="Times New Roman" w:cs="Times New Roman"/>
-              </w:rPr>
-              <w:t>: BBKT số {{soBBKT}}</w:t>
-            </w:r>
-          </w:p>
-        </w:tc>
-      </w:tr>
-      <w:tr>
-        <w:tblPrEx>
-          <w:tblCellMar>
-            <w:top w:w="0" w:type="dxa"/>
-            <w:bottom w:w="0" w:type="dxa"/>
-          </w:tblCellMar>
-        </w:tblPrEx>
-        <w:tc>
-          <w:tcPr>
-            <w:tcW w:w="4253" w:type="dxa"/>
-          </w:tcPr>
-          <w:p>
-            <w:pPr>
-              <w:spacing w:after="60"/>
-            </w:pPr>
-            <w:r>
-              <w:rPr>
-                <w:rFonts w:ascii="Times New Roman" w:hAnsi="Times New Roman" w:cs="Times New Roman"/>
-              </w:rPr>
-              <w:t>Mã KKS: {{maKKS}}</w:t>
-            </w:r>
-          </w:p>
-        </w:tc>
-        <w:tc>
-          <w:tcPr>
-            <w:tcW w:w="5103" w:type="dxa"/>
-          </w:tcPr>
-          <w:p>
-            <w:pPr>
-              <w:spacing w:after="60"/>
-            </w:pPr>
-            <w:r>
-              <w:rPr>
-                <w:rFonts w:ascii="Times New Roman" w:hAnsi="Times New Roman" w:cs="Times New Roman"/>
-              </w:rPr>
-              <w:t>Ngày bổ sung: {{ngayXuat}}</w:t>
-            </w:r>
-          </w:p>
-        </w:tc>
-      </w:tr>
-      <w:tr>
-        <w:tblPrEx>
-          <w:tblCellMar>
-            <w:top w:w="0" w:type="dxa"/>
-            <w:bottom w:w="0" w:type="dxa"/>
-          </w:tblCellMar>
-        </w:tblPrEx>
-        <w:tc>
-          <w:tcPr>
-            <w:tcW w:w="4253" w:type="dxa"/>
-            <w:vMerge w:val="restart"/>
-          </w:tcPr>
-          <w:p>
-            <w:pPr>
-              <w:spacing w:after="60"/>
-            </w:pPr>
-            <w:r>
-              <w:rPr>
-                <w:rFonts w:ascii="Times New Roman" w:hAnsi="Times New Roman" w:cs="Times New Roman"/>
-              </w:rPr>
-              <w:t>Thông số kỹ thuật: {{tenVatTu}}</w:t>
-            </w:r>
-          </w:p>
-        </w:tc>
-        <w:tc>
-          <w:tcPr>
-            <w:tcW w:w="5103" w:type="dxa"/>
-          </w:tcPr>
-          <w:p>
-            <w:pPr>
-              <w:spacing w:after="60"/>
-            </w:pPr>
-            <w:r>
-              <w:rPr>
-                <w:rFonts w:ascii="Times New Roman" w:hAnsi="Times New Roman" w:cs="Times New Roman"/>
-              </w:rPr>
-              <w:t>Thời tiết: Bình thường</w:t>
-            </w:r>
-          </w:p>
-        </w:tc>
-      </w:tr>
-      <w:tr>
-        <w:tblPrEx>
-          <w:tblCellMar>
-            <w:top w:w="0" w:type="dxa"/>
-            <w:bottom w:w="0" w:type="dxa"/>
-          </w:tblCellMar>
-        </w:tblPrEx>
-        <w:tc>
-          <w:tcPr>
-            <w:tcW w:w="4253" w:type="dxa"/>
-            <w:vMerge/>
-          </w:tcPr>
-          <w:p>
-            <w:pPr>
-              <w:spacing w:after="60"/>
-            </w:pPr>
-          </w:p>
-        </w:tc>
-        <w:tc>
-          <w:tcPr>
-            <w:tcW w:w="5103" w:type="dxa"/>
-          </w:tcPr>
-          <w:p>
-            <w:pPr>
-              <w:spacing w:after="0"/>
-            </w:pPr>
-            <w:r>
-              <w:rPr>
-                <w:rFonts w:ascii="Times New Roman" w:hAnsi="Times New Roman" w:cs="Times New Roman"/>
-              </w:rPr>
-              <w:t>Người kiểm tra:</w:t>
-            </w:r>
-          </w:p>
-          <w:p>
-            <w:pPr>
-              <w:spacing w:after="0"/>
-            </w:pPr>
-            <w:proofErr w:type="gramStart"/>
-            <w:r>
-              <w:rPr>
-                <w:rFonts w:ascii="Times New Roman" w:hAnsi="Times New Roman" w:cs="Times New Roman"/>
-              </w:rPr>
-              <w:t>{{tenChiHuy}} -</w:t>
-            </w:r>
-            <w:proofErr w:type="gramEnd"/>
-            <w:r>
-              <w:rPr>
-                <w:rFonts w:ascii="Times New Roman" w:hAnsi="Times New Roman" w:cs="Times New Roman"/>
-              </w:rPr>
-              <w:t xml:space="preserve"> SCCN</w:t>
-            </w:r>
-          </w:p>
-          <w:p>
-            <w:pPr>
-              <w:spacing w:after="0"/>
-            </w:pPr>
-            <w:proofErr w:type="gramStart"/>
-            <w:r>
-              <w:rPr>
-                <w:rFonts w:ascii="Times New Roman" w:hAnsi="Times New Roman" w:cs="Times New Roman"/>
-                <w:sz w:val="26"/>
-                <w:szCs w:val="26"/>
-              </w:rPr>
-              <w:t>{{usedByName}}</w:t>
-            </w:r>
-            <w:r>
-              <w:rPr>
-                <w:rFonts w:ascii="Times New Roman" w:hAnsi="Times New Roman" w:cs="Times New Roman"/>
-              </w:rPr>
-              <w:t xml:space="preserve">- </w:t>
-            </w:r>
-            <w:r>
-              <w:rPr>
-                <w:rFonts w:ascii="Times New Roman" w:hAnsi="Times New Roman" w:cs="Times New Roman"/>
-                <w:sz w:val="26"/>
-                <w:szCs w:val="26"/>
-              </w:rPr>
-              <w:t>{{</w:t>
-            </w:r>
-            <w:proofErr w:type="gramEnd"/>
-            <w:r>
-              <w:rPr>
-                <w:rFonts w:ascii="Times New Roman" w:hAnsi="Times New Roman" w:cs="Times New Roman"/>
-                <w:sz w:val="26"/>
-                <w:szCs w:val="26"/>
-              </w:rPr>
-              <w:t>usedByPosition}}</w:t>
+              <w:t>{{usedByPosition}}</w:t>
             </w:r>
           </w:p>
         </w:tc>
@@ -567,12 +487,6 @@
         <w:gridCol w:w="1525"/>
       </w:tblGrid>
       <w:tr>
-        <w:tblPrEx>
-          <w:tblCellMar>
-            <w:top w:w="0" w:type="dxa"/>
-            <w:bottom w:w="0" w:type="dxa"/>
-          </w:tblCellMar>
-        </w:tblPrEx>
         <w:tc>
           <w:tcPr>
             <w:tcW w:w="600" w:type="dxa"/>
@@ -665,12 +579,6 @@
         </w:tc>
       </w:tr>
       <w:tr>
-        <w:tblPrEx>
-          <w:tblCellMar>
-            <w:top w:w="0" w:type="dxa"/>
-            <w:bottom w:w="0" w:type="dxa"/>
-          </w:tblCellMar>
-        </w:tblPrEx>
         <w:tc>
           <w:tcPr>
             <w:tcW w:w="600" w:type="dxa"/>
@@ -836,12 +744,6 @@
         <w:gridCol w:w="2459"/>
       </w:tblGrid>
       <w:tr>
-        <w:tblPrEx>
-          <w:tblCellMar>
-            <w:top w:w="0" w:type="dxa"/>
-            <w:bottom w:w="0" w:type="dxa"/>
-          </w:tblCellMar>
-        </w:tblPrEx>
         <w:tc>
           <w:tcPr>
             <w:tcW w:w="600" w:type="dxa"/>
@@ -934,12 +836,6 @@
         </w:tc>
       </w:tr>
       <w:tr>
-        <w:tblPrEx>
-          <w:tblCellMar>
-            <w:top w:w="0" w:type="dxa"/>
-            <w:bottom w:w="0" w:type="dxa"/>
-          </w:tblCellMar>
-        </w:tblPrEx>
         <w:tc>
           <w:tcPr>
             <w:tcW w:w="600" w:type="dxa"/>
@@ -1026,13 +922,7 @@
               <w:rPr>
                 <w:rFonts w:ascii="Times New Roman" w:hAnsi="Times New Roman" w:cs="Times New Roman"/>
               </w:rPr>
-              <w:t xml:space="preserve"> </w:t>
-            </w:r>
-            <w:r>
-              <w:rPr>
-                <w:rFonts w:ascii="Times New Roman" w:hAnsi="Times New Roman" w:cs="Times New Roman"/>
-              </w:rPr>
-              <w:t>{{ngayXuat}}</w:t>
+              <w:t xml:space="preserve"> {{ngayXuat}}</w:t>
             </w:r>
           </w:p>
         </w:tc>
@@ -1065,12 +955,6 @@
         <w:gridCol w:w="4727"/>
       </w:tblGrid>
       <w:tr>
-        <w:tblPrEx>
-          <w:tblCellMar>
-            <w:top w:w="0" w:type="dxa"/>
-            <w:bottom w:w="0" w:type="dxa"/>
-          </w:tblCellMar>
-        </w:tblPrEx>
         <w:tc>
           <w:tcPr>
             <w:tcW w:w="5000" w:type="dxa"/>
@@ -1109,12 +993,6 @@
         </w:tc>
       </w:tr>
       <w:tr>
-        <w:tblPrEx>
-          <w:tblCellMar>
-            <w:top w:w="0" w:type="dxa"/>
-            <w:bottom w:w="0" w:type="dxa"/>
-          </w:tblCellMar>
-        </w:tblPrEx>
         <w:tc>
           <w:tcPr>
             <w:tcW w:w="5000" w:type="dxa"/>

</xml_diff>

<commit_message>
feat(materials): dien 'Ly do' (proposalNote) vao Phieu DXVT va BBNT ky tay
Token {{Lydo}} do phan xuong them trong 2 file mau Word — code dien tu
proposalNote (o Ly do buoc Xac nhan yeu cau / Ghi chu ly do luc tao phieu).

Co-Authored-By: Claude Fable 5 <noreply@anthropic.com>
</commit_message>
<xml_diff>
--- a/templates/bbnt-template.docx
+++ b/templates/bbnt-template.docx
@@ -191,7 +191,14 @@
               <w:rPr>
                 <w:rFonts w:ascii="Times New Roman" w:hAnsi="Times New Roman" w:cs="Times New Roman"/>
               </w:rPr>
-              <w:t xml:space="preserve">PCT số: </w:t>
+              <w:t xml:space="preserve">PCT </w:t>
+            </w:r>
+            <w:proofErr w:type="gramStart"/>
+            <w:r>
+              <w:rPr>
+                <w:rFonts w:ascii="Times New Roman" w:hAnsi="Times New Roman" w:cs="Times New Roman"/>
+              </w:rPr>
+              <w:t xml:space="preserve">số: </w:t>
             </w:r>
             <w:r>
               <w:rPr>
@@ -199,7 +206,16 @@
                 <w:sz w:val="26"/>
                 <w:szCs w:val="26"/>
               </w:rPr>
-              <w:t>{{pctNumber}}</w:t>
+              <w:t>{{</w:t>
+            </w:r>
+            <w:proofErr w:type="gramEnd"/>
+            <w:r>
+              <w:rPr>
+                <w:rFonts w:ascii="Times New Roman" w:hAnsi="Times New Roman" w:cs="Times New Roman"/>
+                <w:sz w:val="26"/>
+                <w:szCs w:val="26"/>
+              </w:rPr>
+              <w:t>pctNumber}}</w:t>
             </w:r>
           </w:p>
         </w:tc>
@@ -241,7 +257,21 @@
               <w:rPr>
                 <w:rFonts w:ascii="Times New Roman" w:hAnsi="Times New Roman" w:cs="Times New Roman"/>
               </w:rPr>
-              <w:t>Lý do:</w:t>
+              <w:t xml:space="preserve">Lý </w:t>
+            </w:r>
+            <w:proofErr w:type="gramStart"/>
+            <w:r>
+              <w:rPr>
+                <w:rFonts w:ascii="Times New Roman" w:hAnsi="Times New Roman" w:cs="Times New Roman"/>
+              </w:rPr>
+              <w:t>do</w:t>
+            </w:r>
+            <w:proofErr w:type="gramEnd"/>
+            <w:r>
+              <w:rPr>
+                <w:rFonts w:ascii="Times New Roman" w:hAnsi="Times New Roman" w:cs="Times New Roman"/>
+              </w:rPr>
+              <w:t>:</w:t>
             </w:r>
             <w:r>
               <w:rPr>
@@ -253,7 +283,21 @@
               <w:rPr>
                 <w:rFonts w:ascii="Times New Roman" w:hAnsi="Times New Roman" w:cs="Times New Roman"/>
               </w:rPr>
-              <w:t>{{soBBKT}}</w:t>
+              <w:t xml:space="preserve">{{Lydo}}. </w:t>
+            </w:r>
+            <w:proofErr w:type="gramStart"/>
+            <w:r>
+              <w:rPr>
+                <w:rFonts w:ascii="Times New Roman" w:hAnsi="Times New Roman" w:cs="Times New Roman"/>
+              </w:rPr>
+              <w:t>{</w:t>
+            </w:r>
+            <w:proofErr w:type="gramEnd"/>
+            <w:r>
+              <w:rPr>
+                <w:rFonts w:ascii="Times New Roman" w:hAnsi="Times New Roman" w:cs="Times New Roman"/>
+              </w:rPr>
+              <w:t>{soBBKT}}</w:t>
             </w:r>
           </w:p>
         </w:tc>
@@ -358,17 +402,26 @@
             <w:pPr>
               <w:spacing w:after="0"/>
             </w:pPr>
-            <w:r>
-              <w:rPr>
-                <w:rFonts w:ascii="Times New Roman" w:hAnsi="Times New Roman" w:cs="Times New Roman"/>
-              </w:rPr>
-              <w:t>{{tenChiHuy}} - SCCN</w:t>
+            <w:proofErr w:type="gramStart"/>
+            <w:r>
+              <w:rPr>
+                <w:rFonts w:ascii="Times New Roman" w:hAnsi="Times New Roman" w:cs="Times New Roman"/>
+              </w:rPr>
+              <w:t>{{tenChiHuy}} -</w:t>
+            </w:r>
+            <w:proofErr w:type="gramEnd"/>
+            <w:r>
+              <w:rPr>
+                <w:rFonts w:ascii="Times New Roman" w:hAnsi="Times New Roman" w:cs="Times New Roman"/>
+              </w:rPr>
+              <w:t xml:space="preserve"> SCCN</w:t>
             </w:r>
           </w:p>
           <w:p>
             <w:pPr>
               <w:spacing w:after="0"/>
             </w:pPr>
+            <w:proofErr w:type="gramStart"/>
             <w:r>
               <w:rPr>
                 <w:rFonts w:ascii="Times New Roman" w:hAnsi="Times New Roman" w:cs="Times New Roman"/>
@@ -389,7 +442,16 @@
                 <w:sz w:val="26"/>
                 <w:szCs w:val="26"/>
               </w:rPr>
-              <w:t>{{usedByPosition}}</w:t>
+              <w:t>{{</w:t>
+            </w:r>
+            <w:proofErr w:type="gramEnd"/>
+            <w:r>
+              <w:rPr>
+                <w:rFonts w:ascii="Times New Roman" w:hAnsi="Times New Roman" w:cs="Times New Roman"/>
+                <w:sz w:val="26"/>
+                <w:szCs w:val="26"/>
+              </w:rPr>
+              <w:t>usedByPosition}}</w:t>
             </w:r>
           </w:p>
         </w:tc>

</xml_diff>

<commit_message>
chore: cập nhật mẫu biên bản vật tư
</commit_message>
<xml_diff>
--- a/templates/bbnt-template.docx
+++ b/templates/bbnt-template.docx
@@ -191,14 +191,7 @@
               <w:rPr>
                 <w:rFonts w:ascii="Times New Roman" w:hAnsi="Times New Roman" w:cs="Times New Roman"/>
               </w:rPr>
-              <w:t xml:space="preserve">PCT </w:t>
-            </w:r>
-            <w:proofErr w:type="gramStart"/>
-            <w:r>
-              <w:rPr>
-                <w:rFonts w:ascii="Times New Roman" w:hAnsi="Times New Roman" w:cs="Times New Roman"/>
-              </w:rPr>
-              <w:t xml:space="preserve">số: </w:t>
+              <w:t xml:space="preserve">PCT số: </w:t>
             </w:r>
             <w:r>
               <w:rPr>
@@ -206,16 +199,73 @@
                 <w:sz w:val="26"/>
                 <w:szCs w:val="26"/>
               </w:rPr>
-              <w:t>{{</w:t>
-            </w:r>
-            <w:proofErr w:type="gramEnd"/>
+              <w:t>{{pctNumber}}</w:t>
+            </w:r>
+          </w:p>
+        </w:tc>
+      </w:tr>
+      <w:tr>
+        <w:tc>
+          <w:tcPr>
+            <w:tcW w:w="4253" w:type="dxa"/>
+          </w:tcPr>
+          <w:p>
+            <w:pPr>
+              <w:spacing w:after="60"/>
+            </w:pPr>
+            <w:r>
+              <w:rPr>
+                <w:rFonts w:ascii="Times New Roman" w:hAnsi="Times New Roman" w:cs="Times New Roman"/>
+              </w:rPr>
+              <w:t xml:space="preserve">Tên thiết bị: </w:t>
+            </w:r>
             <w:r>
               <w:rPr>
                 <w:rFonts w:ascii="Times New Roman" w:hAnsi="Times New Roman" w:cs="Times New Roman"/>
                 <w:sz w:val="26"/>
                 <w:szCs w:val="26"/>
               </w:rPr>
-              <w:t>pctNumber}}</w:t>
+              <w:t>{{deviceNameManual}}</w:t>
+            </w:r>
+          </w:p>
+        </w:tc>
+        <w:tc>
+          <w:tcPr>
+            <w:tcW w:w="5103" w:type="dxa"/>
+          </w:tcPr>
+          <w:p>
+            <w:pPr>
+              <w:spacing w:after="60"/>
+            </w:pPr>
+            <w:r>
+              <w:rPr>
+                <w:rFonts w:ascii="Times New Roman" w:hAnsi="Times New Roman" w:cs="Times New Roman"/>
+              </w:rPr>
+              <w:t>Lý do:</w:t>
+            </w:r>
+            <w:r>
+              <w:rPr>
+                <w:rFonts w:ascii="Times New Roman" w:hAnsi="Times New Roman" w:cs="Times New Roman"/>
+              </w:rPr>
+              <w:t xml:space="preserve"> </w:t>
+            </w:r>
+            <w:r>
+              <w:rPr>
+                <w:rFonts w:ascii="Times New Roman" w:hAnsi="Times New Roman" w:cs="Times New Roman"/>
+              </w:rPr>
+              <w:t xml:space="preserve">{{Lydo}}. </w:t>
+            </w:r>
+            <w:r>
+              <w:rPr>
+                <w:rFonts w:ascii="Times New Roman" w:hAnsi="Times New Roman" w:cs="Times New Roman"/>
+              </w:rPr>
+              <w:t xml:space="preserve">BBKT: </w:t>
+            </w:r>
+            <w:r>
+              <w:rPr>
+                <w:rFonts w:ascii="Times New Roman" w:hAnsi="Times New Roman" w:cs="Times New Roman"/>
+              </w:rPr>
+              <w:t>{{soBBKT}}</w:t>
             </w:r>
           </w:p>
         </w:tc>
@@ -233,225 +283,125 @@
               <w:rPr>
                 <w:rFonts w:ascii="Times New Roman" w:hAnsi="Times New Roman" w:cs="Times New Roman"/>
               </w:rPr>
-              <w:t xml:space="preserve">Tên thiết bị: </w:t>
-            </w:r>
+              <w:t>Mã KKS: {{maKKS}}</w:t>
+            </w:r>
+          </w:p>
+        </w:tc>
+        <w:tc>
+          <w:tcPr>
+            <w:tcW w:w="5103" w:type="dxa"/>
+          </w:tcPr>
+          <w:p>
+            <w:pPr>
+              <w:spacing w:after="60"/>
+            </w:pPr>
+            <w:r>
+              <w:rPr>
+                <w:rFonts w:ascii="Times New Roman" w:hAnsi="Times New Roman" w:cs="Times New Roman"/>
+              </w:rPr>
+              <w:t>Ngày bổ sung: {{ngayXuat}}</w:t>
+            </w:r>
+          </w:p>
+        </w:tc>
+      </w:tr>
+      <w:tr>
+        <w:tc>
+          <w:tcPr>
+            <w:tcW w:w="4253" w:type="dxa"/>
+            <w:vMerge w:val="restart"/>
+          </w:tcPr>
+          <w:p>
+            <w:pPr>
+              <w:spacing w:after="60"/>
+            </w:pPr>
+            <w:r>
+              <w:rPr>
+                <w:rFonts w:ascii="Times New Roman" w:hAnsi="Times New Roman" w:cs="Times New Roman"/>
+              </w:rPr>
+              <w:t>Thông số kỹ thuật: {{tenVatTu}}</w:t>
+            </w:r>
+          </w:p>
+        </w:tc>
+        <w:tc>
+          <w:tcPr>
+            <w:tcW w:w="5103" w:type="dxa"/>
+          </w:tcPr>
+          <w:p>
+            <w:pPr>
+              <w:spacing w:after="60"/>
+            </w:pPr>
+            <w:r>
+              <w:rPr>
+                <w:rFonts w:ascii="Times New Roman" w:hAnsi="Times New Roman" w:cs="Times New Roman"/>
+              </w:rPr>
+              <w:t>Thời tiết: Bình thường</w:t>
+            </w:r>
+          </w:p>
+        </w:tc>
+      </w:tr>
+      <w:tr>
+        <w:tc>
+          <w:tcPr>
+            <w:tcW w:w="4253" w:type="dxa"/>
+            <w:vMerge/>
+          </w:tcPr>
+          <w:p>
+            <w:pPr>
+              <w:spacing w:after="60"/>
+            </w:pPr>
+          </w:p>
+        </w:tc>
+        <w:tc>
+          <w:tcPr>
+            <w:tcW w:w="5103" w:type="dxa"/>
+          </w:tcPr>
+          <w:p>
+            <w:pPr>
+              <w:spacing w:after="0"/>
+            </w:pPr>
+            <w:r>
+              <w:rPr>
+                <w:rFonts w:ascii="Times New Roman" w:hAnsi="Times New Roman" w:cs="Times New Roman"/>
+              </w:rPr>
+              <w:t>Người kiểm tra:</w:t>
+            </w:r>
+          </w:p>
+          <w:p>
+            <w:pPr>
+              <w:spacing w:after="0"/>
+            </w:pPr>
+            <w:r>
+              <w:rPr>
+                <w:rFonts w:ascii="Times New Roman" w:hAnsi="Times New Roman" w:cs="Times New Roman"/>
+              </w:rPr>
+              <w:t>{{tenChiHuy}} - SCCN</w:t>
+            </w:r>
+          </w:p>
+          <w:p>
+            <w:pPr>
+              <w:spacing w:after="0"/>
+            </w:pPr>
             <w:r>
               <w:rPr>
                 <w:rFonts w:ascii="Times New Roman" w:hAnsi="Times New Roman" w:cs="Times New Roman"/>
                 <w:sz w:val="26"/>
                 <w:szCs w:val="26"/>
               </w:rPr>
-              <w:t>{{deviceNameManual}}</w:t>
-            </w:r>
-          </w:p>
-        </w:tc>
-        <w:tc>
-          <w:tcPr>
-            <w:tcW w:w="5103" w:type="dxa"/>
-          </w:tcPr>
-          <w:p>
-            <w:pPr>
-              <w:spacing w:after="60"/>
-            </w:pPr>
-            <w:r>
-              <w:rPr>
-                <w:rFonts w:ascii="Times New Roman" w:hAnsi="Times New Roman" w:cs="Times New Roman"/>
-              </w:rPr>
-              <w:t xml:space="preserve">Lý </w:t>
-            </w:r>
-            <w:proofErr w:type="gramStart"/>
-            <w:r>
-              <w:rPr>
-                <w:rFonts w:ascii="Times New Roman" w:hAnsi="Times New Roman" w:cs="Times New Roman"/>
-              </w:rPr>
-              <w:t>do</w:t>
-            </w:r>
-            <w:proofErr w:type="gramEnd"/>
-            <w:r>
-              <w:rPr>
-                <w:rFonts w:ascii="Times New Roman" w:hAnsi="Times New Roman" w:cs="Times New Roman"/>
-              </w:rPr>
-              <w:t>:</w:t>
-            </w:r>
-            <w:r>
-              <w:rPr>
-                <w:rFonts w:ascii="Times New Roman" w:hAnsi="Times New Roman" w:cs="Times New Roman"/>
-              </w:rPr>
-              <w:t xml:space="preserve"> </w:t>
-            </w:r>
-            <w:r>
-              <w:rPr>
-                <w:rFonts w:ascii="Times New Roman" w:hAnsi="Times New Roman" w:cs="Times New Roman"/>
-              </w:rPr>
-              <w:t xml:space="preserve">{{Lydo}}. </w:t>
-            </w:r>
-            <w:proofErr w:type="gramStart"/>
-            <w:r>
-              <w:rPr>
-                <w:rFonts w:ascii="Times New Roman" w:hAnsi="Times New Roman" w:cs="Times New Roman"/>
-              </w:rPr>
-              <w:t>{</w:t>
-            </w:r>
-            <w:proofErr w:type="gramEnd"/>
-            <w:r>
-              <w:rPr>
-                <w:rFonts w:ascii="Times New Roman" w:hAnsi="Times New Roman" w:cs="Times New Roman"/>
-              </w:rPr>
-              <w:t>{soBBKT}}</w:t>
-            </w:r>
-          </w:p>
-        </w:tc>
-      </w:tr>
-      <w:tr>
-        <w:tc>
-          <w:tcPr>
-            <w:tcW w:w="4253" w:type="dxa"/>
-          </w:tcPr>
-          <w:p>
-            <w:pPr>
-              <w:spacing w:after="60"/>
-            </w:pPr>
-            <w:r>
-              <w:rPr>
-                <w:rFonts w:ascii="Times New Roman" w:hAnsi="Times New Roman" w:cs="Times New Roman"/>
-              </w:rPr>
-              <w:t>Mã KKS: {{maKKS}}</w:t>
-            </w:r>
-          </w:p>
-        </w:tc>
-        <w:tc>
-          <w:tcPr>
-            <w:tcW w:w="5103" w:type="dxa"/>
-          </w:tcPr>
-          <w:p>
-            <w:pPr>
-              <w:spacing w:after="60"/>
-            </w:pPr>
-            <w:r>
-              <w:rPr>
-                <w:rFonts w:ascii="Times New Roman" w:hAnsi="Times New Roman" w:cs="Times New Roman"/>
-              </w:rPr>
-              <w:t>Ngày bổ sung: {{ngayXuat}}</w:t>
-            </w:r>
-          </w:p>
-        </w:tc>
-      </w:tr>
-      <w:tr>
-        <w:tc>
-          <w:tcPr>
-            <w:tcW w:w="4253" w:type="dxa"/>
-            <w:vMerge w:val="restart"/>
-          </w:tcPr>
-          <w:p>
-            <w:pPr>
-              <w:spacing w:after="60"/>
-            </w:pPr>
-            <w:r>
-              <w:rPr>
-                <w:rFonts w:ascii="Times New Roman" w:hAnsi="Times New Roman" w:cs="Times New Roman"/>
-              </w:rPr>
-              <w:t>Thông số kỹ thuật: {{tenVatTu}}</w:t>
-            </w:r>
-          </w:p>
-        </w:tc>
-        <w:tc>
-          <w:tcPr>
-            <w:tcW w:w="5103" w:type="dxa"/>
-          </w:tcPr>
-          <w:p>
-            <w:pPr>
-              <w:spacing w:after="60"/>
-            </w:pPr>
-            <w:r>
-              <w:rPr>
-                <w:rFonts w:ascii="Times New Roman" w:hAnsi="Times New Roman" w:cs="Times New Roman"/>
-              </w:rPr>
-              <w:t>Thời tiết: Bình thường</w:t>
-            </w:r>
-          </w:p>
-        </w:tc>
-      </w:tr>
-      <w:tr>
-        <w:tc>
-          <w:tcPr>
-            <w:tcW w:w="4253" w:type="dxa"/>
-            <w:vMerge/>
-          </w:tcPr>
-          <w:p>
-            <w:pPr>
-              <w:spacing w:after="60"/>
-            </w:pPr>
-          </w:p>
-        </w:tc>
-        <w:tc>
-          <w:tcPr>
-            <w:tcW w:w="5103" w:type="dxa"/>
-          </w:tcPr>
-          <w:p>
-            <w:pPr>
-              <w:spacing w:after="0"/>
-            </w:pPr>
-            <w:r>
-              <w:rPr>
-                <w:rFonts w:ascii="Times New Roman" w:hAnsi="Times New Roman" w:cs="Times New Roman"/>
-              </w:rPr>
-              <w:t>Người kiểm tra:</w:t>
-            </w:r>
-          </w:p>
-          <w:p>
-            <w:pPr>
-              <w:spacing w:after="0"/>
-            </w:pPr>
-            <w:proofErr w:type="gramStart"/>
-            <w:r>
-              <w:rPr>
-                <w:rFonts w:ascii="Times New Roman" w:hAnsi="Times New Roman" w:cs="Times New Roman"/>
-              </w:rPr>
-              <w:t>{{tenChiHuy}} -</w:t>
-            </w:r>
-            <w:proofErr w:type="gramEnd"/>
-            <w:r>
-              <w:rPr>
-                <w:rFonts w:ascii="Times New Roman" w:hAnsi="Times New Roman" w:cs="Times New Roman"/>
-              </w:rPr>
-              <w:t xml:space="preserve"> SCCN</w:t>
-            </w:r>
-          </w:p>
-          <w:p>
-            <w:pPr>
-              <w:spacing w:after="0"/>
-            </w:pPr>
-            <w:proofErr w:type="gramStart"/>
+              <w:t>{{usedByName}}</w:t>
+            </w:r>
+            <w:r>
+              <w:rPr>
+                <w:rFonts w:ascii="Times New Roman" w:hAnsi="Times New Roman" w:cs="Times New Roman"/>
+              </w:rPr>
+              <w:t xml:space="preserve">- </w:t>
+            </w:r>
             <w:r>
               <w:rPr>
                 <w:rFonts w:ascii="Times New Roman" w:hAnsi="Times New Roman" w:cs="Times New Roman"/>
                 <w:sz w:val="26"/>
                 <w:szCs w:val="26"/>
               </w:rPr>
-              <w:t>{{usedByName}}</w:t>
-            </w:r>
-            <w:r>
-              <w:rPr>
-                <w:rFonts w:ascii="Times New Roman" w:hAnsi="Times New Roman" w:cs="Times New Roman"/>
-              </w:rPr>
-              <w:t xml:space="preserve">- </w:t>
-            </w:r>
-            <w:r>
-              <w:rPr>
-                <w:rFonts w:ascii="Times New Roman" w:hAnsi="Times New Roman" w:cs="Times New Roman"/>
-                <w:sz w:val="26"/>
-                <w:szCs w:val="26"/>
-              </w:rPr>
-              <w:t>{{</w:t>
-            </w:r>
-            <w:proofErr w:type="gramEnd"/>
-            <w:r>
-              <w:rPr>
-                <w:rFonts w:ascii="Times New Roman" w:hAnsi="Times New Roman" w:cs="Times New Roman"/>
-                <w:sz w:val="26"/>
-                <w:szCs w:val="26"/>
-              </w:rPr>
-              <w:t>usedByPosition}}</w:t>
+              <w:t>{{usedByPosition}}</w:t>
             </w:r>
           </w:p>
         </w:tc>

</xml_diff>

<commit_message>
feat(vật tư): xuất BBTHVT cùng BBNT ký tay
Suy trạng thái thu hồi từ lý do thay thế/thay mới, ghi nhận số lượng và ngày VHV trả kho. Xuất BBTHVT đồng thời với BBNT ký tay và hỗ trợ lưu tệp local khi phát triển.
</commit_message>
<xml_diff>
--- a/templates/bbnt-template.docx
+++ b/templates/bbnt-template.docx
@@ -379,24 +379,8 @@
             <w:r>
               <w:rPr>
                 <w:rFonts w:ascii="Times New Roman" w:hAnsi="Times New Roman" w:cs="Times New Roman"/>
-                <w:sz w:val="26"/>
-                <w:szCs w:val="26"/>
-              </w:rPr>
-              <w:t>{{usedByName}}</w:t>
-            </w:r>
-            <w:r>
-              <w:rPr>
-                <w:rFonts w:ascii="Times New Roman" w:hAnsi="Times New Roman" w:cs="Times New Roman"/>
-              </w:rPr>
-              <w:t xml:space="preserve">- </w:t>
-            </w:r>
-            <w:r>
-              <w:rPr>
-                <w:rFonts w:ascii="Times New Roman" w:hAnsi="Times New Roman" w:cs="Times New Roman"/>
-                <w:sz w:val="26"/>
-                <w:szCs w:val="26"/>
-              </w:rPr>
-              <w:t>{{usedByPosition}}</w:t>
+              </w:rPr>
+              <w:t>{{usedByName}}- {{usedByPosition}}</w:t>
             </w:r>
           </w:p>
         </w:tc>
@@ -744,11 +728,11 @@
         <w:tblLook w:val="04A0" w:firstRow="1" w:lastRow="0" w:firstColumn="1" w:lastColumn="0" w:noHBand="0" w:noVBand="1"/>
       </w:tblPr>
       <w:tblGrid>
-        <w:gridCol w:w="614"/>
-        <w:gridCol w:w="3488"/>
-        <w:gridCol w:w="1292"/>
-        <w:gridCol w:w="1581"/>
-        <w:gridCol w:w="2459"/>
+        <w:gridCol w:w="615"/>
+        <w:gridCol w:w="3541"/>
+        <w:gridCol w:w="1310"/>
+        <w:gridCol w:w="1584"/>
+        <w:gridCol w:w="2384"/>
       </w:tblGrid>
       <w:tr>
         <w:tc>
@@ -929,7 +913,7 @@
               <w:rPr>
                 <w:rFonts w:ascii="Times New Roman" w:hAnsi="Times New Roman" w:cs="Times New Roman"/>
               </w:rPr>
-              <w:t xml:space="preserve"> {{ngayXuat}}</w:t>
+              <w:t xml:space="preserve"> </w:t>
             </w:r>
           </w:p>
         </w:tc>
@@ -1011,6 +995,11 @@
           </w:p>
           <w:p>
             <w:pPr>
+              <w:spacing w:after="600"/>
+            </w:pPr>
+          </w:p>
+          <w:p>
+            <w:pPr>
               <w:spacing w:after="60"/>
               <w:jc w:val="center"/>
             </w:pPr>
@@ -1027,6 +1016,11 @@
           <w:tcPr>
             <w:tcW w:w="5000" w:type="dxa"/>
           </w:tcPr>
+          <w:p>
+            <w:pPr>
+              <w:spacing w:after="600"/>
+            </w:pPr>
+          </w:p>
           <w:p>
             <w:pPr>
               <w:spacing w:after="600"/>

</xml_diff>